<commit_message>
Update referral sheet download
</commit_message>
<xml_diff>
--- a/docs/referral-sheet.docx
+++ b/docs/referral-sheet.docx
@@ -2,68 +2,2077 @@
 <file path=word/document.xml><?xml version="1.0" encoding="utf-8"?>
 <w:document xmlns:wpc="http://schemas.microsoft.com/office/word/2010/wordprocessingCanvas" xmlns:mo="http://schemas.microsoft.com/office/mac/office/2008/main" xmlns:mc="http://schemas.openxmlformats.org/markup-compatibility/2006" xmlns:mv="urn:schemas-microsoft-com:mac:vml" xmlns:o="urn:schemas-microsoft-com:office:office" xmlns:r="http://schemas.openxmlformats.org/officeDocument/2006/relationships" xmlns:m="http://schemas.openxmlformats.org/officeDocument/2006/math" xmlns:v="urn:schemas-microsoft-com:vml" xmlns:wp14="http://schemas.microsoft.com/office/word/2010/wordprocessingDrawing" xmlns:wp="http://schemas.openxmlformats.org/drawingml/2006/wordprocessingDrawing" xmlns:w10="urn:schemas-microsoft-com:office:word" xmlns:w="http://schemas.openxmlformats.org/wordprocessingml/2006/main" xmlns:w14="http://schemas.microsoft.com/office/word/2010/wordml" xmlns:wpg="http://schemas.microsoft.com/office/word/2010/wordprocessingGroup" xmlns:wpi="http://schemas.microsoft.com/office/word/2010/wordprocessingInk" xmlns:wne="http://schemas.microsoft.com/office/word/2006/wordml" xmlns:wps="http://schemas.microsoft.com/office/word/2010/wordprocessingShape" mc:Ignorable="w14 wp14">
   <w:body>
+    <w:tbl>
+      <w:tblPr>
+        <w:tblW w:type="dxa" w:w="9360"/>
+        <w:jc w:val="left"/>
+        <w:tblLayout w:type="fixed"/>
+        <w:tblLook w:firstColumn="1" w:firstRow="1" w:lastColumn="0" w:lastRow="0" w:noHBand="0" w:noVBand="1" w:val="04A0"/>
+        <w:tblInd w:w="120" w:type="dxa"/>
+      </w:tblPr>
+      <w:tblGrid>
+        <w:gridCol w:w="2400"/>
+        <w:gridCol w:w="6960"/>
+      </w:tblGrid>
+      <w:tr>
+        <w:tc>
+          <w:tcPr>
+            <w:tcW w:type="dxa" w:w="2400"/>
+            <w:vAlign w:val="center"/>
+            <w:tcMar>
+              <w:top w:w="90" w:type="dxa"/>
+              <w:start w:w="120" w:type="dxa"/>
+              <w:bottom w:w="90" w:type="dxa"/>
+              <w:end w:w="120" w:type="dxa"/>
+            </w:tcMar>
+            <w:tcBorders>
+              <w:top w:val="single" w:sz="6" w:space="0" w:color="DED2C2"/>
+              <w:left w:val="single" w:sz="6" w:space="0" w:color="DED2C2"/>
+              <w:bottom w:val="single" w:sz="6" w:space="0" w:color="DED2C2"/>
+              <w:right w:val="single" w:sz="6" w:space="0" w:color="DED2C2"/>
+            </w:tcBorders>
+          </w:tcPr>
+          <w:p>
+            <w:pPr>
+              <w:spacing w:before="0" w:after="0" w:line="276" w:lineRule="auto"/>
+              <w:jc w:val="left"/>
+            </w:pPr>
+            <w:r>
+              <w:drawing>
+                <wp:inline xmlns:a="http://schemas.openxmlformats.org/drawingml/2006/main" xmlns:pic="http://schemas.openxmlformats.org/drawingml/2006/picture">
+                  <wp:extent cx="1170432" cy="1170432"/>
+                  <wp:docPr id="1" name="Picture 1"/>
+                  <wp:cNvGraphicFramePr>
+                    <a:graphicFrameLocks noChangeAspect="1"/>
+                  </wp:cNvGraphicFramePr>
+                  <a:graphic>
+                    <a:graphicData uri="http://schemas.openxmlformats.org/drawingml/2006/picture">
+                      <pic:pic>
+                        <pic:nvPicPr>
+                          <pic:cNvPr id="0" name="logo.png"/>
+                          <pic:cNvPicPr/>
+                        </pic:nvPicPr>
+                        <pic:blipFill>
+                          <a:blip r:embed="rId10"/>
+                          <a:stretch>
+                            <a:fillRect/>
+                          </a:stretch>
+                        </pic:blipFill>
+                        <pic:spPr>
+                          <a:xfrm>
+                            <a:off x="0" y="0"/>
+                            <a:ext cx="1170432" cy="1170432"/>
+                          </a:xfrm>
+                          <a:prstGeom prst="rect"/>
+                        </pic:spPr>
+                      </pic:pic>
+                    </a:graphicData>
+                  </a:graphic>
+                </wp:inline>
+              </w:drawing>
+            </w:r>
+          </w:p>
+        </w:tc>
+        <w:tc>
+          <w:tcPr>
+            <w:tcW w:type="dxa" w:w="6960"/>
+            <w:vAlign w:val="center"/>
+            <w:tcMar>
+              <w:top w:w="90" w:type="dxa"/>
+              <w:start w:w="120" w:type="dxa"/>
+              <w:bottom w:w="90" w:type="dxa"/>
+              <w:end w:w="120" w:type="dxa"/>
+            </w:tcMar>
+            <w:tcBorders>
+              <w:top w:val="single" w:sz="6" w:space="0" w:color="DED2C2"/>
+              <w:left w:val="single" w:sz="6" w:space="0" w:color="DED2C2"/>
+              <w:bottom w:val="single" w:sz="6" w:space="0" w:color="DED2C2"/>
+              <w:right w:val="single" w:sz="6" w:space="0" w:color="DED2C2"/>
+            </w:tcBorders>
+          </w:tcPr>
+          <w:p>
+            <w:pPr>
+              <w:spacing w:before="0" w:after="0" w:line="276" w:lineRule="auto"/>
+              <w:jc w:val="right"/>
+            </w:pPr>
+            <w:r>
+              <w:rPr>
+                <w:rFonts w:ascii="Calibri" w:hAnsi="Calibri"/>
+                <w:b/>
+                <w:color w:val="294F3C"/>
+                <w:sz w:val="24"/>
+              </w:rPr>
+              <w:t>RUSH CONNECT &amp; CARE</w:t>
+            </w:r>
+            <w:r>
+              <w:rPr>
+                <w:rFonts w:ascii="Calibri" w:hAnsi="Calibri"/>
+                <w:b w:val="0"/>
+                <w:color w:val="59615A"/>
+                <w:sz w:val="18"/>
+              </w:rPr>
+              <w:br/>
+              <w:t>Referral form | Melbourne, Victoria</w:t>
+            </w:r>
+          </w:p>
+        </w:tc>
+      </w:tr>
+    </w:tbl>
     <w:p>
       <w:pPr>
-        <w:pStyle w:val="Heading1"/>
+        <w:keepNext/>
+        <w:spacing w:before="320" w:after="40"/>
       </w:pPr>
       <w:r>
-        <w:t>Rush Connect and Care - Referral Log</w:t>
+        <w:rPr>
+          <w:rFonts w:ascii="Calibri" w:hAnsi="Calibri"/>
+          <w:b/>
+          <w:color w:val="294F3C"/>
+          <w:sz w:val="48"/>
+        </w:rPr>
+        <w:t>Referral Sheet</w:t>
       </w:r>
     </w:p>
     <w:p>
       <w:pPr>
-        <w:pStyle w:val="Heading2"/>
+        <w:spacing w:before="0" w:after="240"/>
       </w:pPr>
       <w:r>
-        <w:t>Date</w:t>
+        <w:rPr>
+          <w:rFonts w:ascii="Calibri" w:hAnsi="Calibri"/>
+          <w:b w:val="0"/>
+          <w:color w:val="59615A"/>
+          <w:sz w:val="22"/>
+        </w:rPr>
+        <w:t>For new referrals and support introductions</w:t>
+      </w:r>
+    </w:p>
+    <w:tbl>
+      <w:tblPr>
+        <w:tblW w:type="dxa" w:w="9360"/>
+        <w:jc w:val="left"/>
+        <w:tblLayout w:type="fixed"/>
+        <w:tblLook w:firstColumn="1" w:firstRow="1" w:lastColumn="0" w:lastRow="0" w:noHBand="0" w:noVBand="1" w:val="04A0"/>
+        <w:tblInd w:w="120" w:type="dxa"/>
+      </w:tblPr>
+      <w:tblGrid>
+        <w:gridCol w:w="9360"/>
+      </w:tblGrid>
+      <w:tr>
+        <w:tc>
+          <w:tcPr>
+            <w:tcW w:type="dxa" w:w="9360"/>
+            <w:vAlign w:val="center"/>
+            <w:tcMar>
+              <w:top w:w="90" w:type="dxa"/>
+              <w:start w:w="120" w:type="dxa"/>
+              <w:bottom w:w="90" w:type="dxa"/>
+              <w:end w:w="120" w:type="dxa"/>
+            </w:tcMar>
+            <w:tcBorders>
+              <w:top w:val="single" w:sz="6" w:space="0" w:color="DED2C2"/>
+              <w:left w:val="single" w:sz="6" w:space="0" w:color="DED2C2"/>
+              <w:bottom w:val="single" w:sz="6" w:space="0" w:color="DED2C2"/>
+              <w:right w:val="single" w:sz="6" w:space="0" w:color="DED2C2"/>
+            </w:tcBorders>
+            <w:shd w:fill="E8F0EA"/>
+          </w:tcPr>
+          <w:p>
+            <w:pPr>
+              <w:spacing w:before="0" w:after="0" w:line="276" w:lineRule="auto"/>
+            </w:pPr>
+            <w:r>
+              <w:rPr>
+                <w:rFonts w:ascii="Calibri" w:hAnsi="Calibri"/>
+                <w:b/>
+                <w:color w:val="294F3C"/>
+                <w:sz w:val="19"/>
+              </w:rPr>
+              <w:t xml:space="preserve">Privacy and suitability note. </w:t>
+            </w:r>
+            <w:r>
+              <w:rPr>
+                <w:rFonts w:ascii="Calibri" w:hAnsi="Calibri"/>
+                <w:b w:val="0"/>
+                <w:color w:val="242628"/>
+                <w:sz w:val="19"/>
+              </w:rPr>
+              <w:t>Please share only information needed to assess the referral and support a safe introduction. Rush Connect &amp; Care will confirm whether the support is an appropriate fit before services begin. For questions, email hello@rushconnectandcare.com.au or call 0423 815 267.</w:t>
+            </w:r>
+          </w:p>
+        </w:tc>
+      </w:tr>
+    </w:tbl>
+    <w:p>
+      <w:pPr>
+        <w:keepNext/>
+        <w:spacing w:before="280" w:after="120"/>
+      </w:pPr>
+      <w:r>
+        <w:rPr>
+          <w:rFonts w:ascii="Calibri" w:hAnsi="Calibri"/>
+          <w:b/>
+          <w:color w:val="294F3C"/>
+          <w:sz w:val="26"/>
+        </w:rPr>
+        <w:t>1. Referrer details</w:t>
+      </w:r>
+    </w:p>
+    <w:tbl>
+      <w:tblPr>
+        <w:tblW w:type="dxa" w:w="9360"/>
+        <w:jc w:val="left"/>
+        <w:tblLayout w:type="fixed"/>
+        <w:tblLook w:firstColumn="1" w:firstRow="1" w:lastColumn="0" w:lastRow="0" w:noHBand="0" w:noVBand="1" w:val="04A0"/>
+        <w:tblInd w:w="120" w:type="dxa"/>
+      </w:tblPr>
+      <w:tblGrid>
+        <w:gridCol w:w="2700"/>
+        <w:gridCol w:w="6660"/>
+      </w:tblGrid>
+      <w:tr>
+        <w:tc>
+          <w:tcPr>
+            <w:tcW w:type="dxa" w:w="2700"/>
+            <w:shd w:fill="F7EFE4"/>
+          </w:tcPr>
+          <w:p>
+            <w:pPr>
+              <w:spacing w:before="0" w:after="0" w:line="276" w:lineRule="auto"/>
+            </w:pPr>
+            <w:r>
+              <w:rPr>
+                <w:rFonts w:ascii="Calibri" w:hAnsi="Calibri"/>
+                <w:b/>
+                <w:color w:val="294F3C"/>
+                <w:sz w:val="19"/>
+              </w:rPr>
+              <w:t>Date of referral</w:t>
+            </w:r>
+          </w:p>
+        </w:tc>
+        <w:tc>
+          <w:tcPr>
+            <w:tcW w:type="dxa" w:w="6660"/>
+          </w:tcPr>
+          <w:p>
+            <w:pPr>
+              <w:spacing w:before="0" w:after="0" w:line="276" w:lineRule="auto"/>
+            </w:pPr>
+            <w:r>
+              <w:rPr>
+                <w:rFonts w:ascii="Calibri" w:hAnsi="Calibri"/>
+                <w:b w:val="0"/>
+                <w:color w:val="59615A"/>
+                <w:sz w:val="20"/>
+              </w:rPr>
+            </w:r>
+          </w:p>
+        </w:tc>
+      </w:tr>
+      <w:tr>
+        <w:tc>
+          <w:tcPr>
+            <w:tcW w:type="dxa" w:w="2700"/>
+            <w:shd w:fill="F7EFE4"/>
+          </w:tcPr>
+          <w:p>
+            <w:pPr>
+              <w:spacing w:before="0" w:after="0" w:line="276" w:lineRule="auto"/>
+            </w:pPr>
+            <w:r>
+              <w:rPr>
+                <w:rFonts w:ascii="Calibri" w:hAnsi="Calibri"/>
+                <w:b/>
+                <w:color w:val="294F3C"/>
+                <w:sz w:val="19"/>
+              </w:rPr>
+              <w:t>Referrer name</w:t>
+            </w:r>
+          </w:p>
+        </w:tc>
+        <w:tc>
+          <w:tcPr>
+            <w:tcW w:type="dxa" w:w="6660"/>
+          </w:tcPr>
+          <w:p>
+            <w:pPr>
+              <w:spacing w:before="0" w:after="0" w:line="276" w:lineRule="auto"/>
+            </w:pPr>
+            <w:r>
+              <w:rPr>
+                <w:rFonts w:ascii="Calibri" w:hAnsi="Calibri"/>
+                <w:b w:val="0"/>
+                <w:color w:val="59615A"/>
+                <w:sz w:val="20"/>
+              </w:rPr>
+            </w:r>
+          </w:p>
+        </w:tc>
+      </w:tr>
+      <w:tr>
+        <w:tc>
+          <w:tcPr>
+            <w:tcW w:type="dxa" w:w="2700"/>
+            <w:shd w:fill="F7EFE4"/>
+          </w:tcPr>
+          <w:p>
+            <w:pPr>
+              <w:spacing w:before="0" w:after="0" w:line="276" w:lineRule="auto"/>
+            </w:pPr>
+            <w:r>
+              <w:rPr>
+                <w:rFonts w:ascii="Calibri" w:hAnsi="Calibri"/>
+                <w:b/>
+                <w:color w:val="294F3C"/>
+                <w:sz w:val="19"/>
+              </w:rPr>
+              <w:t>Organisation / service</w:t>
+            </w:r>
+          </w:p>
+        </w:tc>
+        <w:tc>
+          <w:tcPr>
+            <w:tcW w:type="dxa" w:w="6660"/>
+          </w:tcPr>
+          <w:p>
+            <w:pPr>
+              <w:spacing w:before="0" w:after="0" w:line="276" w:lineRule="auto"/>
+            </w:pPr>
+            <w:r>
+              <w:rPr>
+                <w:rFonts w:ascii="Calibri" w:hAnsi="Calibri"/>
+                <w:b w:val="0"/>
+                <w:color w:val="59615A"/>
+                <w:sz w:val="20"/>
+              </w:rPr>
+            </w:r>
+          </w:p>
+        </w:tc>
+      </w:tr>
+      <w:tr>
+        <w:tc>
+          <w:tcPr>
+            <w:tcW w:type="dxa" w:w="2700"/>
+            <w:shd w:fill="F7EFE4"/>
+          </w:tcPr>
+          <w:p>
+            <w:pPr>
+              <w:spacing w:before="0" w:after="0" w:line="276" w:lineRule="auto"/>
+            </w:pPr>
+            <w:r>
+              <w:rPr>
+                <w:rFonts w:ascii="Calibri" w:hAnsi="Calibri"/>
+                <w:b/>
+                <w:color w:val="294F3C"/>
+                <w:sz w:val="19"/>
+              </w:rPr>
+              <w:t>Role / relationship to participant</w:t>
+            </w:r>
+          </w:p>
+        </w:tc>
+        <w:tc>
+          <w:tcPr>
+            <w:tcW w:type="dxa" w:w="6660"/>
+          </w:tcPr>
+          <w:p>
+            <w:pPr>
+              <w:spacing w:before="0" w:after="0" w:line="276" w:lineRule="auto"/>
+            </w:pPr>
+            <w:r>
+              <w:rPr>
+                <w:rFonts w:ascii="Calibri" w:hAnsi="Calibri"/>
+                <w:b w:val="0"/>
+                <w:color w:val="59615A"/>
+                <w:sz w:val="20"/>
+              </w:rPr>
+            </w:r>
+          </w:p>
+        </w:tc>
+      </w:tr>
+      <w:tr>
+        <w:tc>
+          <w:tcPr>
+            <w:tcW w:type="dxa" w:w="2700"/>
+            <w:shd w:fill="F7EFE4"/>
+          </w:tcPr>
+          <w:p>
+            <w:pPr>
+              <w:spacing w:before="0" w:after="0" w:line="276" w:lineRule="auto"/>
+            </w:pPr>
+            <w:r>
+              <w:rPr>
+                <w:rFonts w:ascii="Calibri" w:hAnsi="Calibri"/>
+                <w:b/>
+                <w:color w:val="294F3C"/>
+                <w:sz w:val="19"/>
+              </w:rPr>
+              <w:t>Phone</w:t>
+            </w:r>
+          </w:p>
+        </w:tc>
+        <w:tc>
+          <w:tcPr>
+            <w:tcW w:type="dxa" w:w="6660"/>
+          </w:tcPr>
+          <w:p>
+            <w:pPr>
+              <w:spacing w:before="0" w:after="0" w:line="276" w:lineRule="auto"/>
+            </w:pPr>
+            <w:r>
+              <w:rPr>
+                <w:rFonts w:ascii="Calibri" w:hAnsi="Calibri"/>
+                <w:b w:val="0"/>
+                <w:color w:val="59615A"/>
+                <w:sz w:val="20"/>
+              </w:rPr>
+            </w:r>
+          </w:p>
+        </w:tc>
+      </w:tr>
+      <w:tr>
+        <w:tc>
+          <w:tcPr>
+            <w:tcW w:type="dxa" w:w="2700"/>
+            <w:shd w:fill="F7EFE4"/>
+          </w:tcPr>
+          <w:p>
+            <w:pPr>
+              <w:spacing w:before="0" w:after="0" w:line="276" w:lineRule="auto"/>
+            </w:pPr>
+            <w:r>
+              <w:rPr>
+                <w:rFonts w:ascii="Calibri" w:hAnsi="Calibri"/>
+                <w:b/>
+                <w:color w:val="294F3C"/>
+                <w:sz w:val="19"/>
+              </w:rPr>
+              <w:t>Email</w:t>
+            </w:r>
+          </w:p>
+        </w:tc>
+        <w:tc>
+          <w:tcPr>
+            <w:tcW w:type="dxa" w:w="6660"/>
+          </w:tcPr>
+          <w:p>
+            <w:pPr>
+              <w:spacing w:before="0" w:after="0" w:line="276" w:lineRule="auto"/>
+            </w:pPr>
+            <w:r>
+              <w:rPr>
+                <w:rFonts w:ascii="Calibri" w:hAnsi="Calibri"/>
+                <w:b w:val="0"/>
+                <w:color w:val="59615A"/>
+                <w:sz w:val="20"/>
+              </w:rPr>
+            </w:r>
+          </w:p>
+        </w:tc>
+      </w:tr>
+      <w:tr>
+        <w:tc>
+          <w:tcPr>
+            <w:tcW w:type="dxa" w:w="2700"/>
+            <w:shd w:fill="F7EFE4"/>
+          </w:tcPr>
+          <w:p>
+            <w:pPr>
+              <w:spacing w:before="0" w:after="0" w:line="276" w:lineRule="auto"/>
+            </w:pPr>
+            <w:r>
+              <w:rPr>
+                <w:rFonts w:ascii="Calibri" w:hAnsi="Calibri"/>
+                <w:b/>
+                <w:color w:val="294F3C"/>
+                <w:sz w:val="19"/>
+              </w:rPr>
+              <w:t>Preferred contact method and best time</w:t>
+            </w:r>
+          </w:p>
+        </w:tc>
+        <w:tc>
+          <w:tcPr>
+            <w:tcW w:type="dxa" w:w="6660"/>
+          </w:tcPr>
+          <w:p>
+            <w:pPr>
+              <w:spacing w:before="0" w:after="0" w:line="276" w:lineRule="auto"/>
+            </w:pPr>
+            <w:r>
+              <w:rPr>
+                <w:rFonts w:ascii="Calibri" w:hAnsi="Calibri"/>
+                <w:b w:val="0"/>
+                <w:color w:val="59615A"/>
+                <w:sz w:val="20"/>
+              </w:rPr>
+            </w:r>
+          </w:p>
+        </w:tc>
+      </w:tr>
+    </w:tbl>
+    <w:p>
+      <w:pPr>
+        <w:keepNext/>
+        <w:spacing w:before="280" w:after="120"/>
+      </w:pPr>
+      <w:r>
+        <w:rPr>
+          <w:rFonts w:ascii="Calibri" w:hAnsi="Calibri"/>
+          <w:b/>
+          <w:color w:val="294F3C"/>
+          <w:sz w:val="26"/>
+        </w:rPr>
+        <w:t>2. Participant details</w:t>
+      </w:r>
+    </w:p>
+    <w:tbl>
+      <w:tblPr>
+        <w:tblW w:type="dxa" w:w="9360"/>
+        <w:jc w:val="left"/>
+        <w:tblLayout w:type="fixed"/>
+        <w:tblLook w:firstColumn="1" w:firstRow="1" w:lastColumn="0" w:lastRow="0" w:noHBand="0" w:noVBand="1" w:val="04A0"/>
+        <w:tblInd w:w="120" w:type="dxa"/>
+      </w:tblPr>
+      <w:tblGrid>
+        <w:gridCol w:w="2700"/>
+        <w:gridCol w:w="6660"/>
+      </w:tblGrid>
+      <w:tr>
+        <w:tc>
+          <w:tcPr>
+            <w:tcW w:type="dxa" w:w="2700"/>
+            <w:shd w:fill="F7EFE4"/>
+          </w:tcPr>
+          <w:p>
+            <w:pPr>
+              <w:spacing w:before="0" w:after="0" w:line="276" w:lineRule="auto"/>
+            </w:pPr>
+            <w:r>
+              <w:rPr>
+                <w:rFonts w:ascii="Calibri" w:hAnsi="Calibri"/>
+                <w:b/>
+                <w:color w:val="294F3C"/>
+                <w:sz w:val="19"/>
+              </w:rPr>
+              <w:t>Participant full name</w:t>
+            </w:r>
+          </w:p>
+        </w:tc>
+        <w:tc>
+          <w:tcPr>
+            <w:tcW w:type="dxa" w:w="6660"/>
+          </w:tcPr>
+          <w:p>
+            <w:pPr>
+              <w:spacing w:before="0" w:after="0" w:line="276" w:lineRule="auto"/>
+            </w:pPr>
+            <w:r>
+              <w:rPr>
+                <w:rFonts w:ascii="Calibri" w:hAnsi="Calibri"/>
+                <w:b w:val="0"/>
+                <w:color w:val="59615A"/>
+                <w:sz w:val="20"/>
+              </w:rPr>
+            </w:r>
+          </w:p>
+        </w:tc>
+      </w:tr>
+      <w:tr>
+        <w:tc>
+          <w:tcPr>
+            <w:tcW w:type="dxa" w:w="2700"/>
+            <w:shd w:fill="F7EFE4"/>
+          </w:tcPr>
+          <w:p>
+            <w:pPr>
+              <w:spacing w:before="0" w:after="0" w:line="276" w:lineRule="auto"/>
+            </w:pPr>
+            <w:r>
+              <w:rPr>
+                <w:rFonts w:ascii="Calibri" w:hAnsi="Calibri"/>
+                <w:b/>
+                <w:color w:val="294F3C"/>
+                <w:sz w:val="19"/>
+              </w:rPr>
+              <w:t>Preferred name and pronouns (optional)</w:t>
+            </w:r>
+          </w:p>
+        </w:tc>
+        <w:tc>
+          <w:tcPr>
+            <w:tcW w:type="dxa" w:w="6660"/>
+          </w:tcPr>
+          <w:p>
+            <w:pPr>
+              <w:spacing w:before="0" w:after="0" w:line="276" w:lineRule="auto"/>
+            </w:pPr>
+            <w:r>
+              <w:rPr>
+                <w:rFonts w:ascii="Calibri" w:hAnsi="Calibri"/>
+                <w:b w:val="0"/>
+                <w:color w:val="59615A"/>
+                <w:sz w:val="20"/>
+              </w:rPr>
+            </w:r>
+          </w:p>
+        </w:tc>
+      </w:tr>
+      <w:tr>
+        <w:tc>
+          <w:tcPr>
+            <w:tcW w:type="dxa" w:w="2700"/>
+            <w:shd w:fill="F7EFE4"/>
+          </w:tcPr>
+          <w:p>
+            <w:pPr>
+              <w:spacing w:before="0" w:after="0" w:line="276" w:lineRule="auto"/>
+            </w:pPr>
+            <w:r>
+              <w:rPr>
+                <w:rFonts w:ascii="Calibri" w:hAnsi="Calibri"/>
+                <w:b/>
+                <w:color w:val="294F3C"/>
+                <w:sz w:val="19"/>
+              </w:rPr>
+              <w:t>Date of birth</w:t>
+            </w:r>
+          </w:p>
+        </w:tc>
+        <w:tc>
+          <w:tcPr>
+            <w:tcW w:type="dxa" w:w="6660"/>
+          </w:tcPr>
+          <w:p>
+            <w:pPr>
+              <w:spacing w:before="0" w:after="0" w:line="276" w:lineRule="auto"/>
+            </w:pPr>
+            <w:r>
+              <w:rPr>
+                <w:rFonts w:ascii="Calibri" w:hAnsi="Calibri"/>
+                <w:b w:val="0"/>
+                <w:color w:val="59615A"/>
+                <w:sz w:val="20"/>
+              </w:rPr>
+            </w:r>
+          </w:p>
+        </w:tc>
+      </w:tr>
+      <w:tr>
+        <w:tc>
+          <w:tcPr>
+            <w:tcW w:type="dxa" w:w="2700"/>
+            <w:shd w:fill="F7EFE4"/>
+          </w:tcPr>
+          <w:p>
+            <w:pPr>
+              <w:spacing w:before="0" w:after="0" w:line="276" w:lineRule="auto"/>
+            </w:pPr>
+            <w:r>
+              <w:rPr>
+                <w:rFonts w:ascii="Calibri" w:hAnsi="Calibri"/>
+                <w:b/>
+                <w:color w:val="294F3C"/>
+                <w:sz w:val="19"/>
+              </w:rPr>
+              <w:t>Address / suburb</w:t>
+            </w:r>
+          </w:p>
+        </w:tc>
+        <w:tc>
+          <w:tcPr>
+            <w:tcW w:type="dxa" w:w="6660"/>
+          </w:tcPr>
+          <w:p>
+            <w:pPr>
+              <w:spacing w:before="0" w:after="0" w:line="276" w:lineRule="auto"/>
+            </w:pPr>
+            <w:r>
+              <w:rPr>
+                <w:rFonts w:ascii="Calibri" w:hAnsi="Calibri"/>
+                <w:b w:val="0"/>
+                <w:color w:val="59615A"/>
+                <w:sz w:val="20"/>
+              </w:rPr>
+            </w:r>
+          </w:p>
+        </w:tc>
+      </w:tr>
+      <w:tr>
+        <w:tc>
+          <w:tcPr>
+            <w:tcW w:type="dxa" w:w="2700"/>
+            <w:shd w:fill="F7EFE4"/>
+          </w:tcPr>
+          <w:p>
+            <w:pPr>
+              <w:spacing w:before="0" w:after="0" w:line="276" w:lineRule="auto"/>
+            </w:pPr>
+            <w:r>
+              <w:rPr>
+                <w:rFonts w:ascii="Calibri" w:hAnsi="Calibri"/>
+                <w:b/>
+                <w:color w:val="294F3C"/>
+                <w:sz w:val="19"/>
+              </w:rPr>
+              <w:t>Phone and email</w:t>
+            </w:r>
+          </w:p>
+        </w:tc>
+        <w:tc>
+          <w:tcPr>
+            <w:tcW w:type="dxa" w:w="6660"/>
+          </w:tcPr>
+          <w:p>
+            <w:pPr>
+              <w:spacing w:before="0" w:after="0" w:line="276" w:lineRule="auto"/>
+            </w:pPr>
+            <w:r>
+              <w:rPr>
+                <w:rFonts w:ascii="Calibri" w:hAnsi="Calibri"/>
+                <w:b w:val="0"/>
+                <w:color w:val="59615A"/>
+                <w:sz w:val="20"/>
+              </w:rPr>
+            </w:r>
+          </w:p>
+        </w:tc>
+      </w:tr>
+      <w:tr>
+        <w:tc>
+          <w:tcPr>
+            <w:tcW w:type="dxa" w:w="2700"/>
+            <w:shd w:fill="F7EFE4"/>
+          </w:tcPr>
+          <w:p>
+            <w:pPr>
+              <w:spacing w:before="0" w:after="0" w:line="276" w:lineRule="auto"/>
+            </w:pPr>
+            <w:r>
+              <w:rPr>
+                <w:rFonts w:ascii="Calibri" w:hAnsi="Calibri"/>
+                <w:b/>
+                <w:color w:val="294F3C"/>
+                <w:sz w:val="19"/>
+              </w:rPr>
+              <w:t>Preferred contact method</w:t>
+            </w:r>
+          </w:p>
+        </w:tc>
+        <w:tc>
+          <w:tcPr>
+            <w:tcW w:type="dxa" w:w="6660"/>
+          </w:tcPr>
+          <w:p>
+            <w:pPr>
+              <w:spacing w:before="0" w:after="0" w:line="276" w:lineRule="auto"/>
+            </w:pPr>
+            <w:r>
+              <w:rPr>
+                <w:rFonts w:ascii="Calibri" w:hAnsi="Calibri"/>
+                <w:b w:val="0"/>
+                <w:color w:val="59615A"/>
+                <w:sz w:val="20"/>
+              </w:rPr>
+            </w:r>
+          </w:p>
+        </w:tc>
+      </w:tr>
+      <w:tr>
+        <w:tc>
+          <w:tcPr>
+            <w:tcW w:type="dxa" w:w="2700"/>
+            <w:shd w:fill="F7EFE4"/>
+          </w:tcPr>
+          <w:p>
+            <w:pPr>
+              <w:spacing w:before="0" w:after="0" w:line="276" w:lineRule="auto"/>
+            </w:pPr>
+            <w:r>
+              <w:rPr>
+                <w:rFonts w:ascii="Calibri" w:hAnsi="Calibri"/>
+                <w:b/>
+                <w:color w:val="294F3C"/>
+                <w:sz w:val="19"/>
+              </w:rPr>
+              <w:t>NDIS number (if relevant)</w:t>
+            </w:r>
+          </w:p>
+        </w:tc>
+        <w:tc>
+          <w:tcPr>
+            <w:tcW w:type="dxa" w:w="6660"/>
+          </w:tcPr>
+          <w:p>
+            <w:pPr>
+              <w:spacing w:before="0" w:after="0" w:line="276" w:lineRule="auto"/>
+            </w:pPr>
+            <w:r>
+              <w:rPr>
+                <w:rFonts w:ascii="Calibri" w:hAnsi="Calibri"/>
+                <w:b w:val="0"/>
+                <w:color w:val="59615A"/>
+                <w:sz w:val="20"/>
+              </w:rPr>
+            </w:r>
+          </w:p>
+        </w:tc>
+      </w:tr>
+    </w:tbl>
+    <w:p>
+      <w:pPr>
+        <w:keepNext/>
+        <w:spacing w:before="280" w:after="120"/>
+      </w:pPr>
+      <w:r>
+        <w:rPr>
+          <w:rFonts w:ascii="Calibri" w:hAnsi="Calibri"/>
+          <w:b/>
+          <w:color w:val="294F3C"/>
+          <w:sz w:val="26"/>
+        </w:rPr>
+        <w:t>3. Emergency contact</w:t>
+      </w:r>
+    </w:p>
+    <w:tbl>
+      <w:tblPr>
+        <w:tblW w:type="dxa" w:w="9360"/>
+        <w:jc w:val="left"/>
+        <w:tblLayout w:type="fixed"/>
+        <w:tblLook w:firstColumn="1" w:firstRow="1" w:lastColumn="0" w:lastRow="0" w:noHBand="0" w:noVBand="1" w:val="04A0"/>
+        <w:tblInd w:w="120" w:type="dxa"/>
+      </w:tblPr>
+      <w:tblGrid>
+        <w:gridCol w:w="2700"/>
+        <w:gridCol w:w="6660"/>
+      </w:tblGrid>
+      <w:tr>
+        <w:tc>
+          <w:tcPr>
+            <w:tcW w:type="dxa" w:w="2700"/>
+            <w:shd w:fill="F7EFE4"/>
+          </w:tcPr>
+          <w:p>
+            <w:pPr>
+              <w:spacing w:before="0" w:after="0" w:line="276" w:lineRule="auto"/>
+            </w:pPr>
+            <w:r>
+              <w:rPr>
+                <w:rFonts w:ascii="Calibri" w:hAnsi="Calibri"/>
+                <w:b/>
+                <w:color w:val="294F3C"/>
+                <w:sz w:val="19"/>
+              </w:rPr>
+              <w:t>Emergency contact name</w:t>
+            </w:r>
+          </w:p>
+        </w:tc>
+        <w:tc>
+          <w:tcPr>
+            <w:tcW w:type="dxa" w:w="6660"/>
+          </w:tcPr>
+          <w:p>
+            <w:pPr>
+              <w:spacing w:before="0" w:after="0" w:line="276" w:lineRule="auto"/>
+            </w:pPr>
+            <w:r>
+              <w:rPr>
+                <w:rFonts w:ascii="Calibri" w:hAnsi="Calibri"/>
+                <w:b w:val="0"/>
+                <w:color w:val="59615A"/>
+                <w:sz w:val="20"/>
+              </w:rPr>
+            </w:r>
+          </w:p>
+        </w:tc>
+      </w:tr>
+      <w:tr>
+        <w:tc>
+          <w:tcPr>
+            <w:tcW w:type="dxa" w:w="2700"/>
+            <w:shd w:fill="F7EFE4"/>
+          </w:tcPr>
+          <w:p>
+            <w:pPr>
+              <w:spacing w:before="0" w:after="0" w:line="276" w:lineRule="auto"/>
+            </w:pPr>
+            <w:r>
+              <w:rPr>
+                <w:rFonts w:ascii="Calibri" w:hAnsi="Calibri"/>
+                <w:b/>
+                <w:color w:val="294F3C"/>
+                <w:sz w:val="19"/>
+              </w:rPr>
+              <w:t>Relationship to participant</w:t>
+            </w:r>
+          </w:p>
+        </w:tc>
+        <w:tc>
+          <w:tcPr>
+            <w:tcW w:type="dxa" w:w="6660"/>
+          </w:tcPr>
+          <w:p>
+            <w:pPr>
+              <w:spacing w:before="0" w:after="0" w:line="276" w:lineRule="auto"/>
+            </w:pPr>
+            <w:r>
+              <w:rPr>
+                <w:rFonts w:ascii="Calibri" w:hAnsi="Calibri"/>
+                <w:b w:val="0"/>
+                <w:color w:val="59615A"/>
+                <w:sz w:val="20"/>
+              </w:rPr>
+            </w:r>
+          </w:p>
+        </w:tc>
+      </w:tr>
+      <w:tr>
+        <w:tc>
+          <w:tcPr>
+            <w:tcW w:type="dxa" w:w="2700"/>
+            <w:shd w:fill="F7EFE4"/>
+          </w:tcPr>
+          <w:p>
+            <w:pPr>
+              <w:spacing w:before="0" w:after="0" w:line="276" w:lineRule="auto"/>
+            </w:pPr>
+            <w:r>
+              <w:rPr>
+                <w:rFonts w:ascii="Calibri" w:hAnsi="Calibri"/>
+                <w:b/>
+                <w:color w:val="294F3C"/>
+                <w:sz w:val="19"/>
+              </w:rPr>
+              <w:t>Phone number</w:t>
+            </w:r>
+          </w:p>
+        </w:tc>
+        <w:tc>
+          <w:tcPr>
+            <w:tcW w:type="dxa" w:w="6660"/>
+          </w:tcPr>
+          <w:p>
+            <w:pPr>
+              <w:spacing w:before="0" w:after="0" w:line="276" w:lineRule="auto"/>
+            </w:pPr>
+            <w:r>
+              <w:rPr>
+                <w:rFonts w:ascii="Calibri" w:hAnsi="Calibri"/>
+                <w:b w:val="0"/>
+                <w:color w:val="59615A"/>
+                <w:sz w:val="20"/>
+              </w:rPr>
+            </w:r>
+          </w:p>
+        </w:tc>
+      </w:tr>
+      <w:tr>
+        <w:tc>
+          <w:tcPr>
+            <w:tcW w:type="dxa" w:w="2700"/>
+            <w:shd w:fill="F7EFE4"/>
+          </w:tcPr>
+          <w:p>
+            <w:pPr>
+              <w:spacing w:before="0" w:after="0" w:line="276" w:lineRule="auto"/>
+            </w:pPr>
+            <w:r>
+              <w:rPr>
+                <w:rFonts w:ascii="Calibri" w:hAnsi="Calibri"/>
+                <w:b/>
+                <w:color w:val="294F3C"/>
+                <w:sz w:val="19"/>
+              </w:rPr>
+              <w:t>Any contact instructions or limits</w:t>
+            </w:r>
+          </w:p>
+        </w:tc>
+        <w:tc>
+          <w:tcPr>
+            <w:tcW w:type="dxa" w:w="6660"/>
+          </w:tcPr>
+          <w:p>
+            <w:pPr>
+              <w:spacing w:before="0" w:after="0" w:line="276" w:lineRule="auto"/>
+            </w:pPr>
+            <w:r>
+              <w:rPr>
+                <w:rFonts w:ascii="Calibri" w:hAnsi="Calibri"/>
+                <w:b w:val="0"/>
+                <w:color w:val="59615A"/>
+                <w:sz w:val="20"/>
+              </w:rPr>
+            </w:r>
+          </w:p>
+        </w:tc>
+      </w:tr>
+    </w:tbl>
+    <w:p>
+      <w:pPr>
+        <w:keepNext/>
+        <w:spacing w:before="280" w:after="120"/>
+      </w:pPr>
+      <w:r>
+        <w:rPr>
+          <w:rFonts w:ascii="Calibri" w:hAnsi="Calibri"/>
+          <w:b/>
+          <w:color w:val="294F3C"/>
+          <w:sz w:val="26"/>
+        </w:rPr>
+        <w:t>4. Reason for referral and support goals</w:t>
       </w:r>
     </w:p>
     <w:p>
       <w:pPr>
-        <w:pStyle w:val="Heading2"/>
+        <w:spacing w:before="0" w:after="140" w:line="276" w:lineRule="auto"/>
       </w:pPr>
       <w:r>
-        <w:t>Name / Organisation</w:t>
-      </w:r>
-    </w:p>
-    <w:p>
-      <w:r>
-        <w:t>Role or Service</w:t>
+        <w:rPr>
+          <w:rFonts w:ascii="Calibri" w:hAnsi="Calibri"/>
+          <w:b w:val="0"/>
+          <w:color w:val="59615A"/>
+          <w:sz w:val="19"/>
+        </w:rPr>
+        <w:t>Please describe the practical support being sought and the participant's own priorities where known.</w:t>
       </w:r>
     </w:p>
     <w:p>
       <w:pPr>
-        <w:pStyle w:val="Heading2"/>
+        <w:keepNext/>
+        <w:spacing w:before="100" w:after="60"/>
       </w:pPr>
       <w:r>
-        <w:t>Contact Details</w:t>
+        <w:rPr>
+          <w:rFonts w:ascii="Calibri" w:hAnsi="Calibri"/>
+          <w:b/>
+          <w:color w:val="294F3C"/>
+          <w:sz w:val="20"/>
+        </w:rPr>
+        <w:t>Reason for referral</w:t>
+      </w:r>
+    </w:p>
+    <w:tbl>
+      <w:tblPr>
+        <w:tblW w:type="dxa" w:w="9360"/>
+        <w:jc w:val="left"/>
+        <w:tblLayout w:type="fixed"/>
+        <w:tblLook w:firstColumn="1" w:firstRow="1" w:lastColumn="0" w:lastRow="0" w:noHBand="0" w:noVBand="1" w:val="04A0"/>
+        <w:tblInd w:w="120" w:type="dxa"/>
+      </w:tblPr>
+      <w:tblGrid>
+        <w:gridCol w:w="9360"/>
+      </w:tblGrid>
+      <w:tr>
+        <w:tc>
+          <w:tcPr>
+            <w:tcW w:type="dxa" w:w="9360"/>
+            <w:vAlign w:val="center"/>
+            <w:tcMar>
+              <w:top w:w="90" w:type="dxa"/>
+              <w:start w:w="120" w:type="dxa"/>
+              <w:bottom w:w="90" w:type="dxa"/>
+              <w:end w:w="120" w:type="dxa"/>
+            </w:tcMar>
+            <w:tcBorders>
+              <w:top w:val="single" w:sz="6" w:space="0" w:color="DED2C2"/>
+              <w:left w:val="single" w:sz="6" w:space="0" w:color="DED2C2"/>
+              <w:bottom w:val="single" w:sz="6" w:space="0" w:color="DED2C2"/>
+              <w:right w:val="single" w:sz="6" w:space="0" w:color="DED2C2"/>
+            </w:tcBorders>
+            <w:shd w:fill="FFFFFF"/>
+          </w:tcPr>
+          <w:p>
+            <w:pPr>
+              <w:spacing w:before="0" w:after="0" w:line="276" w:lineRule="auto"/>
+            </w:pPr>
+            <w:r>
+              <w:rPr>
+                <w:rFonts w:ascii="Calibri" w:hAnsi="Calibri"/>
+                <w:b w:val="0"/>
+                <w:color w:val="59615A"/>
+                <w:sz w:val="19"/>
+              </w:rPr>
+              <w:t>What support is being requested, and why now?</w:t>
+            </w:r>
+            <w:r>
+              <w:br/>
+            </w:r>
+            <w:r>
+              <w:br/>
+            </w:r>
+            <w:r>
+              <w:br/>
+            </w:r>
+          </w:p>
+        </w:tc>
+      </w:tr>
+    </w:tbl>
+    <w:p>
+      <w:pPr>
+        <w:keepNext/>
+        <w:spacing w:before="100" w:after="60"/>
+      </w:pPr>
+      <w:r>
+        <w:rPr>
+          <w:rFonts w:ascii="Calibri" w:hAnsi="Calibri"/>
+          <w:b/>
+          <w:color w:val="294F3C"/>
+          <w:sz w:val="20"/>
+        </w:rPr>
+        <w:t>Participant goals and desired outcomes</w:t>
+      </w:r>
+    </w:p>
+    <w:tbl>
+      <w:tblPr>
+        <w:tblW w:type="dxa" w:w="9360"/>
+        <w:jc w:val="left"/>
+        <w:tblLayout w:type="fixed"/>
+        <w:tblLook w:firstColumn="1" w:firstRow="1" w:lastColumn="0" w:lastRow="0" w:noHBand="0" w:noVBand="1" w:val="04A0"/>
+        <w:tblInd w:w="120" w:type="dxa"/>
+      </w:tblPr>
+      <w:tblGrid>
+        <w:gridCol w:w="9360"/>
+      </w:tblGrid>
+      <w:tr>
+        <w:tc>
+          <w:tcPr>
+            <w:tcW w:type="dxa" w:w="9360"/>
+            <w:vAlign w:val="center"/>
+            <w:tcMar>
+              <w:top w:w="90" w:type="dxa"/>
+              <w:start w:w="120" w:type="dxa"/>
+              <w:bottom w:w="90" w:type="dxa"/>
+              <w:end w:w="120" w:type="dxa"/>
+            </w:tcMar>
+            <w:tcBorders>
+              <w:top w:val="single" w:sz="6" w:space="0" w:color="DED2C2"/>
+              <w:left w:val="single" w:sz="6" w:space="0" w:color="DED2C2"/>
+              <w:bottom w:val="single" w:sz="6" w:space="0" w:color="DED2C2"/>
+              <w:right w:val="single" w:sz="6" w:space="0" w:color="DED2C2"/>
+            </w:tcBorders>
+            <w:shd w:fill="FFFFFF"/>
+          </w:tcPr>
+          <w:p>
+            <w:pPr>
+              <w:spacing w:before="0" w:after="0" w:line="276" w:lineRule="auto"/>
+            </w:pPr>
+            <w:r>
+              <w:rPr>
+                <w:rFonts w:ascii="Calibri" w:hAnsi="Calibri"/>
+                <w:b w:val="0"/>
+                <w:color w:val="59615A"/>
+                <w:sz w:val="19"/>
+              </w:rPr>
+              <w:t>For example: community participation, routine, appointments, confidence, social connection, transport, practical support or independence.</w:t>
+            </w:r>
+            <w:r>
+              <w:br/>
+            </w:r>
+            <w:r>
+              <w:br/>
+            </w:r>
+            <w:r>
+              <w:br/>
+            </w:r>
+          </w:p>
+        </w:tc>
+      </w:tr>
+    </w:tbl>
+    <w:p>
+      <w:pPr>
+        <w:keepNext/>
+        <w:spacing w:before="100" w:after="60"/>
+      </w:pPr>
+      <w:r>
+        <w:rPr>
+          <w:rFonts w:ascii="Calibri" w:hAnsi="Calibri"/>
+          <w:b/>
+          <w:color w:val="294F3C"/>
+          <w:sz w:val="20"/>
+        </w:rPr>
+        <w:t>Strengths, interests and what helps engagement</w:t>
+      </w:r>
+    </w:p>
+    <w:tbl>
+      <w:tblPr>
+        <w:tblW w:type="dxa" w:w="9360"/>
+        <w:jc w:val="left"/>
+        <w:tblLayout w:type="fixed"/>
+        <w:tblLook w:firstColumn="1" w:firstRow="1" w:lastColumn="0" w:lastRow="0" w:noHBand="0" w:noVBand="1" w:val="04A0"/>
+        <w:tblInd w:w="120" w:type="dxa"/>
+      </w:tblPr>
+      <w:tblGrid>
+        <w:gridCol w:w="9360"/>
+      </w:tblGrid>
+      <w:tr>
+        <w:tc>
+          <w:tcPr>
+            <w:tcW w:type="dxa" w:w="9360"/>
+            <w:vAlign w:val="center"/>
+            <w:tcMar>
+              <w:top w:w="90" w:type="dxa"/>
+              <w:start w:w="120" w:type="dxa"/>
+              <w:bottom w:w="90" w:type="dxa"/>
+              <w:end w:w="120" w:type="dxa"/>
+            </w:tcMar>
+            <w:tcBorders>
+              <w:top w:val="single" w:sz="6" w:space="0" w:color="DED2C2"/>
+              <w:left w:val="single" w:sz="6" w:space="0" w:color="DED2C2"/>
+              <w:bottom w:val="single" w:sz="6" w:space="0" w:color="DED2C2"/>
+              <w:right w:val="single" w:sz="6" w:space="0" w:color="DED2C2"/>
+            </w:tcBorders>
+            <w:shd w:fill="FFFFFF"/>
+          </w:tcPr>
+          <w:p>
+            <w:pPr>
+              <w:spacing w:before="0" w:after="0" w:line="276" w:lineRule="auto"/>
+            </w:pPr>
+            <w:r>
+              <w:rPr>
+                <w:rFonts w:ascii="Calibri" w:hAnsi="Calibri"/>
+                <w:b w:val="0"/>
+                <w:color w:val="59615A"/>
+                <w:sz w:val="19"/>
+              </w:rPr>
+              <w:t>Interests, routines, preferred activities, communication style, motivators or existing supports.</w:t>
+            </w:r>
+            <w:r>
+              <w:br/>
+            </w:r>
+            <w:r>
+              <w:br/>
+            </w:r>
+          </w:p>
+        </w:tc>
+      </w:tr>
+    </w:tbl>
+    <w:p>
+      <w:pPr>
+        <w:keepNext/>
+        <w:spacing w:before="280" w:after="120"/>
+      </w:pPr>
+      <w:r>
+        <w:rPr>
+          <w:rFonts w:ascii="Calibri" w:hAnsi="Calibri"/>
+          <w:b/>
+          <w:color w:val="294F3C"/>
+          <w:sz w:val="26"/>
+        </w:rPr>
+        <w:t>5. Support information</w:t>
+      </w:r>
+    </w:p>
+    <w:tbl>
+      <w:tblPr>
+        <w:tblW w:type="dxa" w:w="9360"/>
+        <w:jc w:val="left"/>
+        <w:tblLayout w:type="fixed"/>
+        <w:tblLook w:firstColumn="1" w:firstRow="1" w:lastColumn="0" w:lastRow="0" w:noHBand="0" w:noVBand="1" w:val="04A0"/>
+        <w:tblInd w:w="120" w:type="dxa"/>
+      </w:tblPr>
+      <w:tblGrid>
+        <w:gridCol w:w="2700"/>
+        <w:gridCol w:w="6660"/>
+      </w:tblGrid>
+      <w:tr>
+        <w:tc>
+          <w:tcPr>
+            <w:tcW w:type="dxa" w:w="2700"/>
+            <w:shd w:fill="F7EFE4"/>
+          </w:tcPr>
+          <w:p>
+            <w:pPr>
+              <w:spacing w:before="0" w:after="0" w:line="276" w:lineRule="auto"/>
+            </w:pPr>
+            <w:r>
+              <w:rPr>
+                <w:rFonts w:ascii="Calibri" w:hAnsi="Calibri"/>
+                <w:b/>
+                <w:color w:val="294F3C"/>
+                <w:sz w:val="19"/>
+              </w:rPr>
+              <w:t>Requested support type</w:t>
+            </w:r>
+          </w:p>
+        </w:tc>
+        <w:tc>
+          <w:tcPr>
+            <w:tcW w:type="dxa" w:w="6660"/>
+          </w:tcPr>
+          <w:p>
+            <w:pPr>
+              <w:spacing w:before="0" w:after="0" w:line="276" w:lineRule="auto"/>
+            </w:pPr>
+            <w:r>
+              <w:rPr>
+                <w:rFonts w:ascii="Calibri" w:hAnsi="Calibri"/>
+                <w:b w:val="0"/>
+                <w:color w:val="59615A"/>
+                <w:sz w:val="20"/>
+              </w:rPr>
+            </w:r>
+          </w:p>
+        </w:tc>
+      </w:tr>
+      <w:tr>
+        <w:tc>
+          <w:tcPr>
+            <w:tcW w:type="dxa" w:w="2700"/>
+            <w:shd w:fill="F7EFE4"/>
+          </w:tcPr>
+          <w:p>
+            <w:pPr>
+              <w:spacing w:before="0" w:after="0" w:line="276" w:lineRule="auto"/>
+            </w:pPr>
+            <w:r>
+              <w:rPr>
+                <w:rFonts w:ascii="Calibri" w:hAnsi="Calibri"/>
+                <w:b/>
+                <w:color w:val="294F3C"/>
+                <w:sz w:val="19"/>
+              </w:rPr>
+              <w:t>Preferred days / times</w:t>
+            </w:r>
+          </w:p>
+        </w:tc>
+        <w:tc>
+          <w:tcPr>
+            <w:tcW w:type="dxa" w:w="6660"/>
+          </w:tcPr>
+          <w:p>
+            <w:pPr>
+              <w:spacing w:before="0" w:after="0" w:line="276" w:lineRule="auto"/>
+            </w:pPr>
+            <w:r>
+              <w:rPr>
+                <w:rFonts w:ascii="Calibri" w:hAnsi="Calibri"/>
+                <w:b w:val="0"/>
+                <w:color w:val="59615A"/>
+                <w:sz w:val="20"/>
+              </w:rPr>
+            </w:r>
+          </w:p>
+        </w:tc>
+      </w:tr>
+      <w:tr>
+        <w:tc>
+          <w:tcPr>
+            <w:tcW w:type="dxa" w:w="2700"/>
+            <w:shd w:fill="F7EFE4"/>
+          </w:tcPr>
+          <w:p>
+            <w:pPr>
+              <w:spacing w:before="0" w:after="0" w:line="276" w:lineRule="auto"/>
+            </w:pPr>
+            <w:r>
+              <w:rPr>
+                <w:rFonts w:ascii="Calibri" w:hAnsi="Calibri"/>
+                <w:b/>
+                <w:color w:val="294F3C"/>
+                <w:sz w:val="19"/>
+              </w:rPr>
+              <w:t>Transport or community access needs</w:t>
+            </w:r>
+          </w:p>
+        </w:tc>
+        <w:tc>
+          <w:tcPr>
+            <w:tcW w:type="dxa" w:w="6660"/>
+          </w:tcPr>
+          <w:p>
+            <w:pPr>
+              <w:spacing w:before="0" w:after="0" w:line="276" w:lineRule="auto"/>
+            </w:pPr>
+            <w:r>
+              <w:rPr>
+                <w:rFonts w:ascii="Calibri" w:hAnsi="Calibri"/>
+                <w:b w:val="0"/>
+                <w:color w:val="59615A"/>
+                <w:sz w:val="20"/>
+              </w:rPr>
+            </w:r>
+          </w:p>
+        </w:tc>
+      </w:tr>
+      <w:tr>
+        <w:tc>
+          <w:tcPr>
+            <w:tcW w:type="dxa" w:w="2700"/>
+            <w:shd w:fill="F7EFE4"/>
+          </w:tcPr>
+          <w:p>
+            <w:pPr>
+              <w:spacing w:before="0" w:after="0" w:line="276" w:lineRule="auto"/>
+            </w:pPr>
+            <w:r>
+              <w:rPr>
+                <w:rFonts w:ascii="Calibri" w:hAnsi="Calibri"/>
+                <w:b/>
+                <w:color w:val="294F3C"/>
+                <w:sz w:val="19"/>
+              </w:rPr>
+              <w:t>Communication, language or cultural preferences</w:t>
+            </w:r>
+          </w:p>
+        </w:tc>
+        <w:tc>
+          <w:tcPr>
+            <w:tcW w:type="dxa" w:w="6660"/>
+          </w:tcPr>
+          <w:p>
+            <w:pPr>
+              <w:spacing w:before="0" w:after="0" w:line="276" w:lineRule="auto"/>
+            </w:pPr>
+            <w:r>
+              <w:rPr>
+                <w:rFonts w:ascii="Calibri" w:hAnsi="Calibri"/>
+                <w:b w:val="0"/>
+                <w:color w:val="59615A"/>
+                <w:sz w:val="20"/>
+              </w:rPr>
+            </w:r>
+          </w:p>
+        </w:tc>
+      </w:tr>
+      <w:tr>
+        <w:tc>
+          <w:tcPr>
+            <w:tcW w:type="dxa" w:w="2700"/>
+            <w:shd w:fill="F7EFE4"/>
+          </w:tcPr>
+          <w:p>
+            <w:pPr>
+              <w:spacing w:before="0" w:after="0" w:line="276" w:lineRule="auto"/>
+            </w:pPr>
+            <w:r>
+              <w:rPr>
+                <w:rFonts w:ascii="Calibri" w:hAnsi="Calibri"/>
+                <w:b/>
+                <w:color w:val="294F3C"/>
+                <w:sz w:val="19"/>
+              </w:rPr>
+              <w:t>Current supports / key contacts (if relevant)</w:t>
+            </w:r>
+          </w:p>
+        </w:tc>
+        <w:tc>
+          <w:tcPr>
+            <w:tcW w:type="dxa" w:w="6660"/>
+          </w:tcPr>
+          <w:p>
+            <w:pPr>
+              <w:spacing w:before="0" w:after="0" w:line="276" w:lineRule="auto"/>
+            </w:pPr>
+            <w:r>
+              <w:rPr>
+                <w:rFonts w:ascii="Calibri" w:hAnsi="Calibri"/>
+                <w:b w:val="0"/>
+                <w:color w:val="59615A"/>
+                <w:sz w:val="20"/>
+              </w:rPr>
+            </w:r>
+          </w:p>
+        </w:tc>
+      </w:tr>
+      <w:tr>
+        <w:tc>
+          <w:tcPr>
+            <w:tcW w:type="dxa" w:w="2700"/>
+            <w:shd w:fill="F7EFE4"/>
+          </w:tcPr>
+          <w:p>
+            <w:pPr>
+              <w:spacing w:before="0" w:after="0" w:line="276" w:lineRule="auto"/>
+            </w:pPr>
+            <w:r>
+              <w:rPr>
+                <w:rFonts w:ascii="Calibri" w:hAnsi="Calibri"/>
+                <w:b/>
+                <w:color w:val="294F3C"/>
+                <w:sz w:val="19"/>
+              </w:rPr>
+              <w:t>Plan management / invoicing contact (if relevant)</w:t>
+            </w:r>
+          </w:p>
+        </w:tc>
+        <w:tc>
+          <w:tcPr>
+            <w:tcW w:type="dxa" w:w="6660"/>
+          </w:tcPr>
+          <w:p>
+            <w:pPr>
+              <w:spacing w:before="0" w:after="0" w:line="276" w:lineRule="auto"/>
+            </w:pPr>
+            <w:r>
+              <w:rPr>
+                <w:rFonts w:ascii="Calibri" w:hAnsi="Calibri"/>
+                <w:b w:val="0"/>
+                <w:color w:val="59615A"/>
+                <w:sz w:val="20"/>
+              </w:rPr>
+            </w:r>
+          </w:p>
+        </w:tc>
+      </w:tr>
+    </w:tbl>
+    <w:p>
+      <w:pPr>
+        <w:keepNext/>
+        <w:spacing w:before="280" w:after="120"/>
+      </w:pPr>
+      <w:r>
+        <w:rPr>
+          <w:rFonts w:ascii="Calibri" w:hAnsi="Calibri"/>
+          <w:b/>
+          <w:color w:val="294F3C"/>
+          <w:sz w:val="26"/>
+        </w:rPr>
+        <w:t>6. Safety and support considerations</w:t>
       </w:r>
     </w:p>
     <w:p>
       <w:pPr>
-        <w:pStyle w:val="Heading2"/>
+        <w:spacing w:before="0" w:after="140" w:line="276" w:lineRule="auto"/>
       </w:pPr>
       <w:r>
-        <w:t>Purpose / Summary</w:t>
+        <w:rPr>
+          <w:rFonts w:ascii="Calibri" w:hAnsi="Calibri"/>
+          <w:b w:val="0"/>
+          <w:color w:val="59615A"/>
+          <w:sz w:val="19"/>
+        </w:rPr>
+        <w:t>Include only information that is relevant to a safe, respectful support introduction.</w:t>
       </w:r>
     </w:p>
     <w:p>
       <w:pPr>
-        <w:pStyle w:val="Heading2"/>
+        <w:keepNext/>
+        <w:spacing w:before="100" w:after="60"/>
       </w:pPr>
       <w:r>
-        <w:t>Outcome</w:t>
+        <w:rPr>
+          <w:rFonts w:ascii="Calibri" w:hAnsi="Calibri"/>
+          <w:b/>
+          <w:color w:val="294F3C"/>
+          <w:sz w:val="20"/>
+        </w:rPr>
+        <w:t>Known risks, triggers, health considerations, safety plans or strategies that may help</w:t>
+      </w:r>
+    </w:p>
+    <w:tbl>
+      <w:tblPr>
+        <w:tblW w:type="dxa" w:w="9360"/>
+        <w:jc w:val="left"/>
+        <w:tblLayout w:type="fixed"/>
+        <w:tblLook w:firstColumn="1" w:firstRow="1" w:lastColumn="0" w:lastRow="0" w:noHBand="0" w:noVBand="1" w:val="04A0"/>
+        <w:tblInd w:w="120" w:type="dxa"/>
+      </w:tblPr>
+      <w:tblGrid>
+        <w:gridCol w:w="9360"/>
+      </w:tblGrid>
+      <w:tr>
+        <w:tc>
+          <w:tcPr>
+            <w:tcW w:type="dxa" w:w="9360"/>
+            <w:vAlign w:val="center"/>
+            <w:tcMar>
+              <w:top w:w="90" w:type="dxa"/>
+              <w:start w:w="120" w:type="dxa"/>
+              <w:bottom w:w="90" w:type="dxa"/>
+              <w:end w:w="120" w:type="dxa"/>
+            </w:tcMar>
+            <w:tcBorders>
+              <w:top w:val="single" w:sz="6" w:space="0" w:color="DED2C2"/>
+              <w:left w:val="single" w:sz="6" w:space="0" w:color="DED2C2"/>
+              <w:bottom w:val="single" w:sz="6" w:space="0" w:color="DED2C2"/>
+              <w:right w:val="single" w:sz="6" w:space="0" w:color="DED2C2"/>
+            </w:tcBorders>
+            <w:shd w:fill="FFFFFF"/>
+          </w:tcPr>
+          <w:p>
+            <w:pPr>
+              <w:spacing w:before="0" w:after="0" w:line="276" w:lineRule="auto"/>
+            </w:pPr>
+            <w:r>
+              <w:rPr>
+                <w:rFonts w:ascii="Calibri" w:hAnsi="Calibri"/>
+                <w:b w:val="0"/>
+                <w:color w:val="59615A"/>
+                <w:sz w:val="19"/>
+              </w:rPr>
+              <w:t>Include emergency or crisis contacts only where relevant to the referral.</w:t>
+            </w:r>
+            <w:r>
+              <w:br/>
+            </w:r>
+            <w:r>
+              <w:br/>
+            </w:r>
+            <w:r>
+              <w:br/>
+            </w:r>
+          </w:p>
+        </w:tc>
+      </w:tr>
+    </w:tbl>
+    <w:p>
+      <w:pPr>
+        <w:keepNext/>
+        <w:spacing w:before="100" w:after="60"/>
+      </w:pPr>
+      <w:r>
+        <w:rPr>
+          <w:rFonts w:ascii="Calibri" w:hAnsi="Calibri"/>
+          <w:b/>
+          <w:color w:val="294F3C"/>
+          <w:sz w:val="20"/>
+        </w:rPr>
+        <w:t>Anything else we should know to support a respectful introduction</w:t>
+      </w:r>
+    </w:p>
+    <w:tbl>
+      <w:tblPr>
+        <w:tblW w:type="dxa" w:w="9360"/>
+        <w:jc w:val="left"/>
+        <w:tblLayout w:type="fixed"/>
+        <w:tblLook w:firstColumn="1" w:firstRow="1" w:lastColumn="0" w:lastRow="0" w:noHBand="0" w:noVBand="1" w:val="04A0"/>
+        <w:tblInd w:w="120" w:type="dxa"/>
+      </w:tblPr>
+      <w:tblGrid>
+        <w:gridCol w:w="9360"/>
+      </w:tblGrid>
+      <w:tr>
+        <w:tc>
+          <w:tcPr>
+            <w:tcW w:type="dxa" w:w="9360"/>
+            <w:vAlign w:val="center"/>
+            <w:tcMar>
+              <w:top w:w="90" w:type="dxa"/>
+              <w:start w:w="120" w:type="dxa"/>
+              <w:bottom w:w="90" w:type="dxa"/>
+              <w:end w:w="120" w:type="dxa"/>
+            </w:tcMar>
+            <w:tcBorders>
+              <w:top w:val="single" w:sz="6" w:space="0" w:color="DED2C2"/>
+              <w:left w:val="single" w:sz="6" w:space="0" w:color="DED2C2"/>
+              <w:bottom w:val="single" w:sz="6" w:space="0" w:color="DED2C2"/>
+              <w:right w:val="single" w:sz="6" w:space="0" w:color="DED2C2"/>
+            </w:tcBorders>
+            <w:shd w:fill="FFFFFF"/>
+          </w:tcPr>
+          <w:p>
+            <w:pPr>
+              <w:spacing w:before="0" w:after="0" w:line="276" w:lineRule="auto"/>
+            </w:pPr>
+            <w:r>
+              <w:br/>
+            </w:r>
+            <w:r>
+              <w:br/>
+            </w:r>
+          </w:p>
+        </w:tc>
+      </w:tr>
+    </w:tbl>
+    <w:p>
+      <w:pPr>
+        <w:keepNext/>
+        <w:spacing w:before="280" w:after="120"/>
+      </w:pPr>
+      <w:r>
+        <w:rPr>
+          <w:rFonts w:ascii="Calibri" w:hAnsi="Calibri"/>
+          <w:b/>
+          <w:color w:val="294F3C"/>
+          <w:sz w:val="26"/>
+        </w:rPr>
+        <w:t>7. Consent to share information</w:t>
+      </w:r>
+    </w:p>
+    <w:tbl>
+      <w:tblPr>
+        <w:tblW w:type="dxa" w:w="9360"/>
+        <w:jc w:val="left"/>
+        <w:tblLayout w:type="fixed"/>
+        <w:tblLook w:firstColumn="1" w:firstRow="1" w:lastColumn="0" w:lastRow="0" w:noHBand="0" w:noVBand="1" w:val="04A0"/>
+        <w:tblInd w:w="120" w:type="dxa"/>
+      </w:tblPr>
+      <w:tblGrid>
+        <w:gridCol w:w="9360"/>
+      </w:tblGrid>
+      <w:tr>
+        <w:tc>
+          <w:tcPr>
+            <w:tcW w:type="dxa" w:w="9360"/>
+            <w:vAlign w:val="center"/>
+            <w:tcMar>
+              <w:top w:w="90" w:type="dxa"/>
+              <w:start w:w="120" w:type="dxa"/>
+              <w:bottom w:w="90" w:type="dxa"/>
+              <w:end w:w="120" w:type="dxa"/>
+            </w:tcMar>
+            <w:tcBorders>
+              <w:top w:val="single" w:sz="6" w:space="0" w:color="DED2C2"/>
+              <w:left w:val="single" w:sz="6" w:space="0" w:color="DED2C2"/>
+              <w:bottom w:val="single" w:sz="6" w:space="0" w:color="DED2C2"/>
+              <w:right w:val="single" w:sz="6" w:space="0" w:color="DED2C2"/>
+            </w:tcBorders>
+            <w:shd w:fill="E8F0EA"/>
+          </w:tcPr>
+          <w:p>
+            <w:pPr>
+              <w:spacing w:before="0" w:after="0" w:line="276" w:lineRule="auto"/>
+            </w:pPr>
+            <w:r>
+              <w:rPr>
+                <w:rFonts w:ascii="Calibri" w:hAnsi="Calibri"/>
+                <w:b w:val="0"/>
+                <w:color w:val="242628"/>
+                <w:sz w:val="19"/>
+              </w:rPr>
+              <w:t>☐  The participant has given consent for the information in this form to be shared with Rush Connect &amp; Care for the purpose of considering this referral.</w:t>
+            </w:r>
+            <w:r>
+              <w:br/>
+            </w:r>
+            <w:r>
+              <w:rPr>
+                <w:rFonts w:ascii="Calibri" w:hAnsi="Calibri"/>
+                <w:b w:val="0"/>
+                <w:color w:val="242628"/>
+                <w:sz w:val="19"/>
+              </w:rPr>
+              <w:t>☐  The participant understands that Rush Connect &amp; Care may contact them or their nominated representative to discuss support options and suitability.</w:t>
+            </w:r>
+            <w:r>
+              <w:br/>
+            </w:r>
+            <w:r>
+              <w:rPr>
+                <w:rFonts w:ascii="Calibri" w:hAnsi="Calibri"/>
+                <w:b w:val="0"/>
+                <w:color w:val="242628"/>
+                <w:sz w:val="19"/>
+              </w:rPr>
+              <w:t>☐  If the participant cannot provide consent directly, the person completing this form has appropriate authority to provide information and discuss the referral.</w:t>
+            </w:r>
+          </w:p>
+        </w:tc>
+      </w:tr>
+    </w:tbl>
+    <w:tbl>
+      <w:tblPr>
+        <w:tblW w:type="dxa" w:w="9360"/>
+        <w:jc w:val="left"/>
+        <w:tblLayout w:type="fixed"/>
+        <w:tblLook w:firstColumn="1" w:firstRow="1" w:lastColumn="0" w:lastRow="0" w:noHBand="0" w:noVBand="1" w:val="04A0"/>
+        <w:tblInd w:w="120" w:type="dxa"/>
+      </w:tblPr>
+      <w:tblGrid>
+        <w:gridCol w:w="2700"/>
+        <w:gridCol w:w="6660"/>
+      </w:tblGrid>
+      <w:tr>
+        <w:tc>
+          <w:tcPr>
+            <w:tcW w:type="dxa" w:w="2700"/>
+            <w:shd w:fill="F7EFE4"/>
+          </w:tcPr>
+          <w:p>
+            <w:pPr>
+              <w:spacing w:before="0" w:after="0" w:line="276" w:lineRule="auto"/>
+            </w:pPr>
+            <w:r>
+              <w:rPr>
+                <w:rFonts w:ascii="Calibri" w:hAnsi="Calibri"/>
+                <w:b/>
+                <w:color w:val="294F3C"/>
+                <w:sz w:val="19"/>
+              </w:rPr>
+              <w:t>Participant / authorised representative name</w:t>
+            </w:r>
+          </w:p>
+        </w:tc>
+        <w:tc>
+          <w:tcPr>
+            <w:tcW w:type="dxa" w:w="6660"/>
+          </w:tcPr>
+          <w:p>
+            <w:pPr>
+              <w:spacing w:before="0" w:after="0" w:line="276" w:lineRule="auto"/>
+            </w:pPr>
+            <w:r>
+              <w:rPr>
+                <w:rFonts w:ascii="Calibri" w:hAnsi="Calibri"/>
+                <w:b w:val="0"/>
+                <w:color w:val="59615A"/>
+                <w:sz w:val="20"/>
+              </w:rPr>
+            </w:r>
+          </w:p>
+        </w:tc>
+      </w:tr>
+      <w:tr>
+        <w:tc>
+          <w:tcPr>
+            <w:tcW w:type="dxa" w:w="2700"/>
+            <w:shd w:fill="F7EFE4"/>
+          </w:tcPr>
+          <w:p>
+            <w:pPr>
+              <w:spacing w:before="0" w:after="0" w:line="276" w:lineRule="auto"/>
+            </w:pPr>
+            <w:r>
+              <w:rPr>
+                <w:rFonts w:ascii="Calibri" w:hAnsi="Calibri"/>
+                <w:b/>
+                <w:color w:val="294F3C"/>
+                <w:sz w:val="19"/>
+              </w:rPr>
+              <w:t>Signature (if used)</w:t>
+            </w:r>
+          </w:p>
+        </w:tc>
+        <w:tc>
+          <w:tcPr>
+            <w:tcW w:type="dxa" w:w="6660"/>
+          </w:tcPr>
+          <w:p>
+            <w:pPr>
+              <w:spacing w:before="0" w:after="0" w:line="276" w:lineRule="auto"/>
+            </w:pPr>
+            <w:r>
+              <w:rPr>
+                <w:rFonts w:ascii="Calibri" w:hAnsi="Calibri"/>
+                <w:b w:val="0"/>
+                <w:color w:val="59615A"/>
+                <w:sz w:val="20"/>
+              </w:rPr>
+            </w:r>
+          </w:p>
+        </w:tc>
+      </w:tr>
+      <w:tr>
+        <w:tc>
+          <w:tcPr>
+            <w:tcW w:type="dxa" w:w="2700"/>
+            <w:shd w:fill="F7EFE4"/>
+          </w:tcPr>
+          <w:p>
+            <w:pPr>
+              <w:spacing w:before="0" w:after="0" w:line="276" w:lineRule="auto"/>
+            </w:pPr>
+            <w:r>
+              <w:rPr>
+                <w:rFonts w:ascii="Calibri" w:hAnsi="Calibri"/>
+                <w:b/>
+                <w:color w:val="294F3C"/>
+                <w:sz w:val="19"/>
+              </w:rPr>
+              <w:t>Date</w:t>
+            </w:r>
+          </w:p>
+        </w:tc>
+        <w:tc>
+          <w:tcPr>
+            <w:tcW w:type="dxa" w:w="6660"/>
+          </w:tcPr>
+          <w:p>
+            <w:pPr>
+              <w:spacing w:before="0" w:after="0" w:line="276" w:lineRule="auto"/>
+            </w:pPr>
+            <w:r>
+              <w:rPr>
+                <w:rFonts w:ascii="Calibri" w:hAnsi="Calibri"/>
+                <w:b w:val="0"/>
+                <w:color w:val="59615A"/>
+                <w:sz w:val="20"/>
+              </w:rPr>
+            </w:r>
+          </w:p>
+        </w:tc>
+      </w:tr>
+    </w:tbl>
+    <w:p>
+      <w:pPr>
+        <w:keepNext/>
+        <w:spacing w:before="280" w:after="120"/>
+      </w:pPr>
+      <w:r>
+        <w:rPr>
+          <w:rFonts w:ascii="Calibri" w:hAnsi="Calibri"/>
+          <w:b/>
+          <w:color w:val="294F3C"/>
+          <w:sz w:val="26"/>
+        </w:rPr>
+        <w:t>8. Referrer declaration</w:t>
       </w:r>
     </w:p>
     <w:p>
+      <w:pPr>
+        <w:spacing w:before="0" w:after="140"/>
+      </w:pPr>
       <w:r>
-        <w:t>Follow-up Date</w:t>
+        <w:rPr>
+          <w:rFonts w:ascii="Calibri" w:hAnsi="Calibri"/>
+          <w:b w:val="0"/>
+          <w:color w:val="242628"/>
+          <w:sz w:val="20"/>
+        </w:rPr>
+        <w:t>I confirm that the information provided is accurate to the best of my knowledge and that the relevant consent has been obtained before this referral is shared.</w:t>
+      </w:r>
+    </w:p>
+    <w:tbl>
+      <w:tblPr>
+        <w:tblW w:type="dxa" w:w="9360"/>
+        <w:jc w:val="left"/>
+        <w:tblLayout w:type="fixed"/>
+        <w:tblLook w:firstColumn="1" w:firstRow="1" w:lastColumn="0" w:lastRow="0" w:noHBand="0" w:noVBand="1" w:val="04A0"/>
+        <w:tblInd w:w="120" w:type="dxa"/>
+      </w:tblPr>
+      <w:tblGrid>
+        <w:gridCol w:w="2700"/>
+        <w:gridCol w:w="6660"/>
+      </w:tblGrid>
+      <w:tr>
+        <w:tc>
+          <w:tcPr>
+            <w:tcW w:type="dxa" w:w="2700"/>
+            <w:shd w:fill="F7EFE4"/>
+          </w:tcPr>
+          <w:p>
+            <w:pPr>
+              <w:spacing w:before="0" w:after="0" w:line="276" w:lineRule="auto"/>
+            </w:pPr>
+            <w:r>
+              <w:rPr>
+                <w:rFonts w:ascii="Calibri" w:hAnsi="Calibri"/>
+                <w:b/>
+                <w:color w:val="294F3C"/>
+                <w:sz w:val="19"/>
+              </w:rPr>
+              <w:t>Referrer name</w:t>
+            </w:r>
+          </w:p>
+        </w:tc>
+        <w:tc>
+          <w:tcPr>
+            <w:tcW w:type="dxa" w:w="6660"/>
+          </w:tcPr>
+          <w:p>
+            <w:pPr>
+              <w:spacing w:before="0" w:after="0" w:line="276" w:lineRule="auto"/>
+            </w:pPr>
+            <w:r>
+              <w:rPr>
+                <w:rFonts w:ascii="Calibri" w:hAnsi="Calibri"/>
+                <w:b w:val="0"/>
+                <w:color w:val="59615A"/>
+                <w:sz w:val="20"/>
+              </w:rPr>
+            </w:r>
+          </w:p>
+        </w:tc>
+      </w:tr>
+      <w:tr>
+        <w:tc>
+          <w:tcPr>
+            <w:tcW w:type="dxa" w:w="2700"/>
+            <w:shd w:fill="F7EFE4"/>
+          </w:tcPr>
+          <w:p>
+            <w:pPr>
+              <w:spacing w:before="0" w:after="0" w:line="276" w:lineRule="auto"/>
+            </w:pPr>
+            <w:r>
+              <w:rPr>
+                <w:rFonts w:ascii="Calibri" w:hAnsi="Calibri"/>
+                <w:b/>
+                <w:color w:val="294F3C"/>
+                <w:sz w:val="19"/>
+              </w:rPr>
+              <w:t>Signature (if used)</w:t>
+            </w:r>
+          </w:p>
+        </w:tc>
+        <w:tc>
+          <w:tcPr>
+            <w:tcW w:type="dxa" w:w="6660"/>
+          </w:tcPr>
+          <w:p>
+            <w:pPr>
+              <w:spacing w:before="0" w:after="0" w:line="276" w:lineRule="auto"/>
+            </w:pPr>
+            <w:r>
+              <w:rPr>
+                <w:rFonts w:ascii="Calibri" w:hAnsi="Calibri"/>
+                <w:b w:val="0"/>
+                <w:color w:val="59615A"/>
+                <w:sz w:val="20"/>
+              </w:rPr>
+            </w:r>
+          </w:p>
+        </w:tc>
+      </w:tr>
+      <w:tr>
+        <w:tc>
+          <w:tcPr>
+            <w:tcW w:type="dxa" w:w="2700"/>
+            <w:shd w:fill="F7EFE4"/>
+          </w:tcPr>
+          <w:p>
+            <w:pPr>
+              <w:spacing w:before="0" w:after="0" w:line="276" w:lineRule="auto"/>
+            </w:pPr>
+            <w:r>
+              <w:rPr>
+                <w:rFonts w:ascii="Calibri" w:hAnsi="Calibri"/>
+                <w:b/>
+                <w:color w:val="294F3C"/>
+                <w:sz w:val="19"/>
+              </w:rPr>
+              <w:t>Date</w:t>
+            </w:r>
+          </w:p>
+        </w:tc>
+        <w:tc>
+          <w:tcPr>
+            <w:tcW w:type="dxa" w:w="6660"/>
+          </w:tcPr>
+          <w:p>
+            <w:pPr>
+              <w:spacing w:before="0" w:after="0" w:line="276" w:lineRule="auto"/>
+            </w:pPr>
+            <w:r>
+              <w:rPr>
+                <w:rFonts w:ascii="Calibri" w:hAnsi="Calibri"/>
+                <w:b w:val="0"/>
+                <w:color w:val="59615A"/>
+                <w:sz w:val="20"/>
+              </w:rPr>
+            </w:r>
+          </w:p>
+        </w:tc>
+      </w:tr>
+    </w:tbl>
+    <w:p>
+      <w:pPr>
+        <w:spacing w:before="280" w:after="0"/>
+        <w:jc w:val="center"/>
+      </w:pPr>
+      <w:r>
+        <w:rPr>
+          <w:rFonts w:ascii="Calibri" w:hAnsi="Calibri"/>
+          <w:b/>
+          <w:color w:val="294F3C"/>
+          <w:sz w:val="20"/>
+        </w:rPr>
+        <w:t>Return completed referrals to hello@rushconnectandcare.com.au</w:t>
       </w:r>
     </w:p>
     <w:sectPr>
-      <w:headerReference w:type="default" r:id="rId9"/>
+      <w:footerReference w:type="default" r:id="rId9"/>
       <w:pgSz w:w="12240" w:h="15840"/>
-      <w:pgMar w:top="1440" w:right="1800" w:bottom="1440" w:left="1800" w:header="288" w:footer="720" w:gutter="0"/>
+      <w:pgMar w:top="1080" w:right="1440" w:bottom="1080" w:left="1440" w:header="504" w:footer="504" w:gutter="0"/>
       <w:cols w:space="720"/>
       <w:docGrid w:linePitch="360"/>
     </w:sectPr>
@@ -71,49 +2080,26 @@
 </w:document>
 </file>
 
-<file path=word/header1.xml><?xml version="1.0" encoding="utf-8"?>
-<w:hdr xmlns:m="http://schemas.openxmlformats.org/officeDocument/2006/math" xmlns:mc="http://schemas.openxmlformats.org/markup-compatibility/2006" xmlns:mo="http://schemas.microsoft.com/office/mac/office/2008/main" xmlns:mv="urn:schemas-microsoft-com:mac:vml" xmlns:o="urn:schemas-microsoft-com:office:office" xmlns:r="http://schemas.openxmlformats.org/officeDocument/2006/relationships" xmlns:v="urn:schemas-microsoft-com:vml" xmlns:w10="urn:schemas-microsoft-com:office:word" xmlns:w14="http://schemas.microsoft.com/office/word/2010/wordml" xmlns:w="http://schemas.openxmlformats.org/wordprocessingml/2006/main" xmlns:wne="http://schemas.microsoft.com/office/word/2006/wordml" xmlns:wp14="http://schemas.microsoft.com/office/word/2010/wordprocessingDrawing" xmlns:wp="http://schemas.openxmlformats.org/drawingml/2006/wordprocessingDrawing" xmlns:wpc="http://schemas.microsoft.com/office/word/2010/wordprocessingCanvas" xmlns:wpg="http://schemas.microsoft.com/office/word/2010/wordprocessingGroup" xmlns:wpi="http://schemas.microsoft.com/office/word/2010/wordprocessingInk" xmlns:wps="http://schemas.microsoft.com/office/word/2010/wordprocessingShape" mc:Ignorable="w14 wp14">
+<file path=word/footer1.xml><?xml version="1.0" encoding="utf-8"?>
+<w:ftr xmlns:m="http://schemas.openxmlformats.org/officeDocument/2006/math" xmlns:mc="http://schemas.openxmlformats.org/markup-compatibility/2006" xmlns:mo="http://schemas.microsoft.com/office/mac/office/2008/main" xmlns:mv="urn:schemas-microsoft-com:mac:vml" xmlns:o="urn:schemas-microsoft-com:office:office" xmlns:r="http://schemas.openxmlformats.org/officeDocument/2006/relationships" xmlns:v="urn:schemas-microsoft-com:vml" xmlns:w10="urn:schemas-microsoft-com:office:word" xmlns:w14="http://schemas.microsoft.com/office/word/2010/wordml" xmlns:w="http://schemas.openxmlformats.org/wordprocessingml/2006/main" xmlns:wne="http://schemas.microsoft.com/office/word/2006/wordml" xmlns:wp14="http://schemas.microsoft.com/office/word/2010/wordprocessingDrawing" xmlns:wp="http://schemas.openxmlformats.org/drawingml/2006/wordprocessingDrawing" xmlns:wpc="http://schemas.microsoft.com/office/word/2010/wordprocessingCanvas" xmlns:wpg="http://schemas.microsoft.com/office/word/2010/wordprocessingGroup" xmlns:wpi="http://schemas.microsoft.com/office/word/2010/wordprocessingInk" xmlns:wps="http://schemas.microsoft.com/office/word/2010/wordprocessingShape" mc:Ignorable="w14 wp14">
   <w:p>
     <w:pPr>
+      <w:pStyle w:val="Footer"/>
       <w:spacing w:before="0" w:after="0"/>
-      <w:jc w:val="center"/>
+      <w:jc w:val="right"/>
     </w:pPr>
     <w:r>
-      <w:drawing>
-        <wp:inline xmlns:a="http://schemas.openxmlformats.org/drawingml/2006/main" xmlns:pic="http://schemas.openxmlformats.org/drawingml/2006/picture">
-          <wp:extent cx="685800" cy="685800"/>
-          <wp:docPr id="1" name="Picture 1"/>
-          <wp:cNvGraphicFramePr>
-            <a:graphicFrameLocks noChangeAspect="1"/>
-          </wp:cNvGraphicFramePr>
-          <a:graphic>
-            <a:graphicData uri="http://schemas.openxmlformats.org/drawingml/2006/picture">
-              <pic:pic>
-                <pic:nvPicPr>
-                  <pic:cNvPr id="0" name="rcc-logo-small.png"/>
-                  <pic:cNvPicPr/>
-                </pic:nvPicPr>
-                <pic:blipFill>
-                  <a:blip r:embed="rId1"/>
-                  <a:stretch>
-                    <a:fillRect/>
-                  </a:stretch>
-                </pic:blipFill>
-                <pic:spPr>
-                  <a:xfrm>
-                    <a:off x="0" y="0"/>
-                    <a:ext cx="685800" cy="685800"/>
-                  </a:xfrm>
-                  <a:prstGeom prst="rect"/>
-                </pic:spPr>
-              </pic:pic>
-            </a:graphicData>
-          </a:graphic>
-        </wp:inline>
-      </w:drawing>
+      <w:rPr>
+        <w:rFonts w:ascii="Calibri" w:hAnsi="Calibri"/>
+        <w:b w:val="0"/>
+        <w:color w:val="59615A"/>
+        <w:sz w:val="17"/>
+      </w:rPr>
+      <w:t xml:space="preserve">Rush Connect &amp; Care | Referral Sheet | Page </w:t>
     </w:r>
+    <w:fldSimple w:instr="PAGE"/>
   </w:p>
-</w:hdr>
+</w:ftr>
 </file>
 
 <file path=word/numbering.xml><?xml version="1.0" encoding="utf-8"?>
@@ -479,9 +2465,13 @@
     <w:name w:val="Normal"/>
     <w:qFormat/>
     <w:rsid w:val="00FC693F"/>
+    <w:pPr>
+      <w:spacing w:after="120" w:line="276" w:lineRule="auto"/>
+    </w:pPr>
     <w:rPr>
-      <w:rFonts w:ascii="Aptos" w:hAnsi="Aptos"/>
-      <w:sz w:val="22"/>
+      <w:rFonts w:ascii="Calibri" w:hAnsi="Calibri"/>
+      <w:color w:val="242628"/>
+      <w:sz w:val="21"/>
     </w:rPr>
   </w:style>
   <w:style w:type="paragraph" w:styleId="Header">

</xml_diff>